<commit_message>
Correcciones Cap 5-6: MASE, estabilidad temporal y referencias consistentes
- Cap 6: corrige referencia a 400 -> 200 series; añade nota metodológica sobre
  MASE > 1 y CV temporal observados en el experimento; elimina afirmación
  incorrecta sobre cumplimiento del criterio CV < 25%
- Cap 5: actualiza valor de referencia del SNaive de 14.45% al resultado real
  del experimento (13.667%)
- Recompila PDF (59 páginas) y exporta Word actualizados
</commit_message>
<xml_diff>
--- a/Memoria/TFM_Entrega2.docx
+++ b/Memoria/TFM_Entrega2.docx
@@ -9604,7 +9604,21 @@
           <w:i/>
           <w:iCs/>
         </w:rPr>
-        <w:t xml:space="preserve">. Referencia sMAPE Seasonal Naïve: 14.45%.</w:t>
+        <w:t xml:space="preserve">. Referencia sMAPE Seasonal Naïve: 13</w:t>
+      </w:r>
+      <w:r>
+        <w:rPr>
+          <w:i/>
+          <w:iCs/>
+        </w:rPr>
+        <w:t xml:space="preserve">,</w:t>
+      </w:r>
+      <w:r>
+        <w:rPr>
+          <w:i/>
+          <w:iCs/>
+        </w:rPr>
+        <w:t xml:space="preserve">667% (resultado experimental).</w:t>
       </w:r>
     </w:p>
     <w:tbl>
@@ -9612,7 +9626,7 @@
         <w:tblStyle w:val="Table"/>
         <w:tblW w:type="auto" w:w="0"/>
         <w:tblLook w:firstRow="1" w:lastRow="0" w:firstColumn="0" w:lastColumn="0" w:noHBand="0" w:noVBand="0" w:val="0020"/>
-        <w:tblCaption w:val="Tabla 13. Evaluación frente a los criterios de éxito predefinidos en la Tabla 4.5. Referencia sMAPE Seasonal Naïve: 14.45%."/>
+        <w:tblCaption w:val="Tabla 13. Evaluación frente a los criterios de éxito predefinidos en la Tabla 4.5. Referencia sMAPE Seasonal Naïve: 13,667% (resultado experimental)."/>
       </w:tblPr>
       <w:tblGrid>
         <w:gridCol w:w="1131"/>
@@ -11130,7 +11144,7 @@
         <w:t xml:space="preserve"> </w:t>
       </w:r>
       <w:r>
-        <w:t xml:space="preserve">requiere que las 400 series de la submuestra compartan patrones suficientemente similares como para que el entrenamiento cruzado sea beneficioso; si los patrones son heterogéneos, el modelo puede no converger a representaciones útiles en el número de épocas empleado.</w:t>
+        <w:t xml:space="preserve">requiere que las 200 series de la submuestra compartan patrones suficientemente similares como para que el entrenamiento cruzado sea beneficioso; si los patrones son heterogéneos, el modelo puede no converger a representaciones útiles en el número de épocas empleado.</w:t>
       </w:r>
     </w:p>
     <w:bookmarkEnd w:id="81"/>
@@ -11194,7 +11208,7 @@
         <w:t xml:space="preserve"> </w:t>
       </w:r>
       <w:r>
-        <w:t xml:space="preserve">muestra que los modelos estadísticos clásicos presentan un comportamiento estable a lo largo de los folds walk-forward: la variabilidad del sMAPE entre iteraciones es reducida, lo que indica que el rendimiento no depende críticamente del período temporal evaluado. Un coeficiente de variación del sMAPE inferior al 25% para ETS y Holt-Winters confirma el criterio de estabilidad predefinido en la Tabla </w:t>
+        <w:t xml:space="preserve">muestra la evolución del sMAPE promedio por fold walk-forward para los modelos locales. El análisis de estabilidad temporal mide el coeficiente de variación (CV) del sMAPE calculado entre los folds de cada serie individual y promediado sobre la submuestra. Con este cálculo, el CV temporal de ETS se sitúa en un 62,8% y el de SARIMA en un 66,6%, valores que superan el umbral del 25% predefinido en la Tabla </w:t>
       </w:r>
       <w:hyperlink w:anchor="tab:criterios">
         <w:r>
@@ -11205,15 +11219,51 @@
         </w:r>
       </w:hyperlink>
       <w:r>
+        <w:t xml:space="preserve">. Este resultado indica que ningún modelo alcanza el criterio de estabilidad, lo que debe interpretarse correctamente: la alta variabilidad refleja fundamentalmente la heterogeneidad de las 200 series de la submuestra (series con distintos niveles de volatilidad y tendencia), no necesariamente un deterioro sistemático del modelo en el tiempo. Con series individuales de comportamiento más homogéneo —como las de un único dominio contable corporativo— la estabilidad esperada sería considerablemente mayor.</w:t>
+      </w:r>
+    </w:p>
+    <w:p>
+      <w:pPr>
+        <w:pStyle w:val="BodyText"/>
+      </w:pPr>
+      <w:r>
+        <w:rPr>
+          <w:b/>
+          <w:bCs/>
+        </w:rPr>
+        <w:t xml:space="preserve">Nota sobre el criterio MASE.</w:t>
+      </w:r>
+      <w:r>
+        <w:t xml:space="preserve"> </w:t>
+      </w:r>
+      <w:r>
+        <w:t xml:space="preserve">La Tabla </w:t>
+      </w:r>
+      <w:hyperlink w:anchor="tab:criterios_resultado">
+        <w:r>
+          <w:rPr>
+            <w:rStyle w:val="Hyperlink"/>
+          </w:rPr>
+          <w:t xml:space="preserve">5.3</w:t>
+        </w:r>
+      </w:hyperlink>
+      <w:r>
+        <w:t xml:space="preserve"> </w:t>
+      </w:r>
+      <w:r>
+        <w:t xml:space="preserve">reporta valores de MASE superiores a 1</w:t>
+      </w:r>
+      <w:r>
+        <w:t xml:space="preserve">,</w:t>
+      </w:r>
+      <w:r>
+        <w:t xml:space="preserve">0 para todos los modelos, lo que indica que el error absoluto medio de los pronósticos supera el error absoluto medio del naïve estacional calculado en muestra. Este resultado no contradice la mejora observada en sMAPE (que sí supera al baseline fuera de muestra), sino que refleja una característica estructural de las series M4 Financial: presentan tendencias y cambios de régimen que hacen que los errores fuera de muestra sean sistemáticamente mayores que los errores en muestra del naïve estacional. Esta observación subraya la importancia de complementar el MASE con métricas porcentuales como el sMAPE a la hora de interpretar el desempeño comparativo en contextos con series no estacionarias</w:t>
+      </w:r>
+      <w:r>
+        <w:t xml:space="preserve"> </w:t>
+      </w:r>
+      <w:r>
         <w:t xml:space="preserve">.</w:t>
-      </w:r>
-    </w:p>
-    <w:p>
-      <w:pPr>
-        <w:pStyle w:val="BodyText"/>
-      </w:pPr>
-      <w:r>
-        <w:t xml:space="preserve">Este resultado tiene implicaciones prácticas directas para FP&amp;A: un modelo cuyo rendimiento varía significativamente entre períodos tiene un valor operacional limitado, porque el analista no puede confiar en él de forma sistemática para el cierre mensual. La estabilidad de los métodos estadísticos clásicos es, en este sentido, una fortaleza adicional que no queda capturada por el sMAPE medio.</w:t>
       </w:r>
     </w:p>
     <w:bookmarkEnd w:id="83"/>
@@ -11373,7 +11423,7 @@
           <m:t>=</m:t>
         </m:r>
         <m:r>
-          <m:t>400</m:t>
+          <m:t>200</m:t>
         </m:r>
       </m:oMath>
       <w:r>

</xml_diff>

<commit_message>
Correcciones Word segun revision: indices, fases y plantilla
- Agrega indices de contenidos, figuras y tablas actualizables (F9)
- Cambia subsecciones Fase 1-6 de Heading 3 numerado a texto en negrita
- Elimina correctamente tabla residual de la plantilla v1.1 del cuerpo
- Agrega salto de pagina entre capitulos para mejor navegacion
</commit_message>
<xml_diff>
--- a/Memoria/TFM_Entrega2.docx
+++ b/Memoria/TFM_Entrega2.docx
@@ -2,7 +2,6 @@
 <file path=word/document.xml><?xml version="1.0" encoding="utf-8"?>
 <w:document xmlns:wpc="http://schemas.microsoft.com/office/word/2010/wordprocessingCanvas" xmlns:cx="http://schemas.microsoft.com/office/drawing/2014/chartex" xmlns:cx1="http://schemas.microsoft.com/office/drawing/2015/9/8/chartex" xmlns:cx2="http://schemas.microsoft.com/office/drawing/2015/10/21/chartex" xmlns:cx3="http://schemas.microsoft.com/office/drawing/2016/5/9/chartex" xmlns:cx4="http://schemas.microsoft.com/office/drawing/2016/5/10/chartex" xmlns:cx5="http://schemas.microsoft.com/office/drawing/2016/5/11/chartex" xmlns:cx6="http://schemas.microsoft.com/office/drawing/2016/5/12/chartex" xmlns:cx7="http://schemas.microsoft.com/office/drawing/2016/5/13/chartex" xmlns:cx8="http://schemas.microsoft.com/office/drawing/2016/5/14/chartex" xmlns:mc="http://schemas.openxmlformats.org/markup-compatibility/2006" xmlns:aink="http://schemas.microsoft.com/office/drawing/2016/ink" xmlns:am3d="http://schemas.microsoft.com/office/drawing/2017/model3d" xmlns:o="urn:schemas-microsoft-com:office:office" xmlns:oel="http://schemas.microsoft.com/office/2019/extlst" xmlns:r="http://schemas.openxmlformats.org/officeDocument/2006/relationships" xmlns:m="http://schemas.openxmlformats.org/officeDocument/2006/math" xmlns:v="urn:schemas-microsoft-com:vml" xmlns:wp14="http://schemas.microsoft.com/office/word/2010/wordprocessingDrawing" xmlns:wp="http://schemas.openxmlformats.org/drawingml/2006/wordprocessingDrawing" xmlns:w10="urn:schemas-microsoft-com:office:word" xmlns:w="http://schemas.openxmlformats.org/wordprocessingml/2006/main" xmlns:w14="http://schemas.microsoft.com/office/word/2010/wordml" xmlns:w15="http://schemas.microsoft.com/office/word/2012/wordml" xmlns:w16cex="http://schemas.microsoft.com/office/word/2018/wordml/cex" xmlns:w16cid="http://schemas.microsoft.com/office/word/2016/wordml/cid" xmlns:w16="http://schemas.microsoft.com/office/word/2018/wordml" xmlns:w16du="http://schemas.microsoft.com/office/word/2023/wordml/word16du" xmlns:w16sdtdh="http://schemas.microsoft.com/office/word/2020/wordml/sdtdatahash" xmlns:w16sdtfl="http://schemas.microsoft.com/office/word/2024/wordml/sdtformatlock" xmlns:w16se="http://schemas.microsoft.com/office/word/2015/wordml/symex" xmlns:wpg="http://schemas.microsoft.com/office/word/2010/wordprocessingGroup" xmlns:wpi="http://schemas.microsoft.com/office/word/2010/wordprocessingInk" xmlns:wne="http://schemas.microsoft.com/office/word/2006/wordml" xmlns:wps="http://schemas.microsoft.com/office/word/2010/wordprocessingShape" xmlns:a="http://schemas.openxmlformats.org/drawingml/2006/main" xmlns:a16="http://schemas.microsoft.com/office/drawing/2014/main" xmlns:pic="http://schemas.openxmlformats.org/drawingml/2006/picture" xmlns:a14="http://schemas.microsoft.com/office/drawing/2010/main" mc:Ignorable="w14 w15 w16se w16cid w16 w16cex w16sdtdh w16sdtfl w16du wp14">
   <w:body>
-    <w:bookmarkEnd w:id="0"/>
     <w:p>
       <w:pPr>
         <w:pStyle w:val="NoSpacing"/>
@@ -204,6 +203,99 @@
           <w:sz w:val="24"/>
         </w:rPr>
         <w:t>2024-2025</w:t>
+      </w:r>
+    </w:p>
+    <w:p>
+      <w:r>
+        <w:br w:type="page"/>
+      </w:r>
+    </w:p>
+    <w:p>
+      <w:pPr>
+        <w:pStyle w:val="Ttulondices"/>
+      </w:pPr>
+      <w:r>
+        <w:t>Índice de contenidos</w:t>
+      </w:r>
+    </w:p>
+    <w:p>
+      <w:pPr/>
+      <w:r>
+        <w:fldChar w:fldCharType="begin"/>
+        <w:instrText xml:space="preserve">TOC \o "1-3" \h \z \u</w:instrText>
+        <w:fldChar w:fldCharType="separate"/>
+      </w:r>
+      <w:r>
+        <w:rPr>
+          <w:i/>
+          <w:color w:val="808080"/>
+        </w:rPr>
+        <w:t>[Actualizar con clic derecho → Actualizar campo]</w:t>
+      </w:r>
+      <w:r>
+        <w:fldChar w:fldCharType="end"/>
+      </w:r>
+    </w:p>
+    <w:p>
+      <w:r>
+        <w:br w:type="page"/>
+      </w:r>
+    </w:p>
+    <w:p>
+      <w:pPr>
+        <w:pStyle w:val="Ttulondices"/>
+      </w:pPr>
+      <w:r>
+        <w:t>Índice de figuras</w:t>
+      </w:r>
+    </w:p>
+    <w:p>
+      <w:pPr/>
+      <w:r>
+        <w:fldChar w:fldCharType="begin"/>
+        <w:instrText xml:space="preserve">TOC \h \z \c "Figuras"</w:instrText>
+        <w:fldChar w:fldCharType="separate"/>
+      </w:r>
+      <w:r>
+        <w:rPr>
+          <w:i/>
+          <w:color w:val="808080"/>
+        </w:rPr>
+        <w:t>[Actualizar con clic derecho → Actualizar campo]</w:t>
+      </w:r>
+      <w:r>
+        <w:fldChar w:fldCharType="end"/>
+      </w:r>
+    </w:p>
+    <w:p>
+      <w:r>
+        <w:br w:type="page"/>
+      </w:r>
+    </w:p>
+    <w:p>
+      <w:pPr>
+        <w:pStyle w:val="Ttulondices"/>
+      </w:pPr>
+      <w:r>
+        <w:t>Índice de tablas</w:t>
+      </w:r>
+    </w:p>
+    <w:p>
+      <w:pPr/>
+      <w:r>
+        <w:fldChar w:fldCharType="begin"/>
+        <w:instrText xml:space="preserve">TOC \h \z \c "Tabla"</w:instrText>
+        <w:fldChar w:fldCharType="separate"/>
+      </w:r>
+      <w:r>
+        <w:rPr>
+          <w:i/>
+          <w:color w:val="808080"/>
+        </w:rPr>
+        <w:t>[Actualizar con clic derecho → Actualizar campo]</w:t>
+      </w:r>
+      <w:r>
+        <w:fldChar w:fldCharType="end"/>
       </w:r>
     </w:p>
     <w:p>
@@ -775,6 +867,11 @@
       </w:r>
       <w:r>
         <w:t xml:space="preserve"> la memoria se mantiene en este repositorio con control de versiones. El código fuente se gestiona en un repositorio privado de GitHub con tablero Kanban en GitHub Projects.</w:t>
+      </w:r>
+    </w:p>
+    <w:p>
+      <w:r>
+        <w:br w:type="page"/>
       </w:r>
     </w:p>
     <w:p>
@@ -1307,6 +1404,11 @@
       <w:pPr/>
       <w:r>
         <w:t>El Anexo A incluye el acceso al repositorio con el código fuente modular desarrollado en Python y la documentación técnica necesaria para la reproducibilidad de los experimentos.</w:t>
+      </w:r>
+    </w:p>
+    <w:p>
+      <w:r>
+        <w:br w:type="page"/>
       </w:r>
     </w:p>
     <w:p>
@@ -2965,6 +3067,11 @@
       </w:r>
     </w:p>
     <w:p>
+      <w:r>
+        <w:br w:type="page"/>
+      </w:r>
+    </w:p>
+    <w:p>
       <w:pPr>
         <w:pStyle w:val="Heading1"/>
       </w:pPr>
@@ -3188,9 +3295,12 @@
     </w:p>
     <w:p>
       <w:pPr>
-        <w:pStyle w:val="Heading3"/>
-      </w:pPr>
-      <w:r>
+        <w:spacing w:before="200" w:after="80"/>
+      </w:pPr>
+      <w:r>
+        <w:rPr>
+          <w:b/>
+        </w:rPr>
         <w:t>Fase 1. Revisión sistemática de la literatura</w:t>
       </w:r>
     </w:p>
@@ -3202,9 +3312,12 @@
     </w:p>
     <w:p>
       <w:pPr>
-        <w:pStyle w:val="Heading3"/>
-      </w:pPr>
-      <w:r>
+        <w:spacing w:before="200" w:after="80"/>
+      </w:pPr>
+      <w:r>
+        <w:rPr>
+          <w:b/>
+        </w:rPr>
         <w:t>Fase 2. Adquisición y preparación de datos</w:t>
       </w:r>
     </w:p>
@@ -3216,9 +3329,12 @@
     </w:p>
     <w:p>
       <w:pPr>
-        <w:pStyle w:val="Heading3"/>
-      </w:pPr>
-      <w:r>
+        <w:spacing w:before="200" w:after="80"/>
+      </w:pPr>
+      <w:r>
+        <w:rPr>
+          <w:b/>
+        </w:rPr>
         <w:t>Fase 3. Diseño del protocolo de backtesting</w:t>
       </w:r>
     </w:p>
@@ -3257,9 +3373,12 @@
     </w:p>
     <w:p>
       <w:pPr>
-        <w:pStyle w:val="Heading3"/>
-      </w:pPr>
-      <w:r>
+        <w:spacing w:before="200" w:after="80"/>
+      </w:pPr>
+      <w:r>
+        <w:rPr>
+          <w:b/>
+        </w:rPr>
         <w:t>Fase 4. Implementación y ajuste de modelos</w:t>
       </w:r>
     </w:p>
@@ -3347,9 +3466,12 @@
     </w:p>
     <w:p>
       <w:pPr>
-        <w:pStyle w:val="Heading3"/>
-      </w:pPr>
-      <w:r>
+        <w:spacing w:before="200" w:after="80"/>
+      </w:pPr>
+      <w:r>
+        <w:rPr>
+          <w:b/>
+        </w:rPr>
         <w:t>Fase 5. Análisis de resultados y construcción del framework</w:t>
       </w:r>
     </w:p>
@@ -3379,9 +3501,12 @@
     </w:p>
     <w:p>
       <w:pPr>
-        <w:pStyle w:val="Heading3"/>
-      </w:pPr>
-      <w:r>
+        <w:spacing w:before="200" w:after="80"/>
+      </w:pPr>
+      <w:r>
+        <w:rPr>
+          <w:b/>
+        </w:rPr>
         <w:t>Fase 6. Redacción, revisión y entrega</w:t>
       </w:r>
     </w:p>
@@ -3389,6 +3514,11 @@
       <w:pPr/>
       <w:r>
         <w:t>La documentación técnica y la memoria del TFE se redactan de forma continua a lo largo del proyecto, con entregas parciales a la directora en los hitos principales de cada fase. La versión final se somete a revisión de coherencia, verificación bibliográfica y corrección ortotipográfica antes de su entrega formal en la plataforma de la universidad.</w:t>
+      </w:r>
+    </w:p>
+    <w:p>
+      <w:r>
+        <w:br w:type="page"/>
       </w:r>
     </w:p>
     <w:p>
@@ -5530,6 +5660,11 @@
       </w:r>
     </w:p>
     <w:p>
+      <w:r>
+        <w:br w:type="page"/>
+      </w:r>
+    </w:p>
+    <w:p>
       <w:pPr>
         <w:pStyle w:val="Heading1"/>
       </w:pPr>
@@ -7484,6 +7619,11 @@
       </w:r>
     </w:p>
     <w:p>
+      <w:r>
+        <w:br w:type="page"/>
+      </w:r>
+    </w:p>
+    <w:p>
       <w:pPr>
         <w:pStyle w:val="Heading1"/>
       </w:pPr>
@@ -7755,6 +7895,11 @@
       </w:r>
     </w:p>
     <w:p>
+      <w:r>
+        <w:br w:type="page"/>
+      </w:r>
+    </w:p>
+    <w:p>
       <w:pPr>
         <w:pStyle w:val="Heading1"/>
       </w:pPr>
@@ -8153,6 +8298,11 @@
       </w:r>
       <w:r>
         <w:t xml:space="preserve"> Los modelos implementados son univariados. La incorporación de indicadores macroeconómicos (tipos de interés, inflación, índices de actividad) mediante arquitecturas que admiten variables exógenas —como SARIMA con regresores o el Temporal Fusion Transformer— podría mejorar el desempeño en entornos con cambios estructurales frecuentes (Lim et al., 2021).</w:t>
+      </w:r>
+    </w:p>
+    <w:p>
+      <w:r>
+        <w:br w:type="page"/>
       </w:r>
     </w:p>
     <w:p>

</xml_diff>